<commit_message>
Remove br.unifor dos pacotes
</commit_message>
<xml_diff>
--- a/relatorio/Relatorio-Ordenacao-Paralela.docx
+++ b/relatorio/Relatorio-Ordenacao-Paralela.docx
@@ -196,28 +196,7 @@
           <w:lang w:val="pt-BR"/>
         </w:rPr>
         <w:br/>
-        <w:t>Autor 1: [NOME DO AUTOR]</w:t>
-      </w:r>
-    </w:p>
-    <w:p>
-      <w:pPr>
-        <w:pStyle w:val="TAMainText"/>
-        <w:ind w:firstLine="0"/>
-        <w:rPr>
-          <w:rFonts w:ascii="Arial" w:hAnsi="Arial" w:cs="Arial"/>
-          <w:i/>
-          <w:iCs/>
-          <w:lang w:val="pt-BR"/>
-        </w:rPr>
-      </w:pPr>
-      <w:r>
-        <w:rPr>
-          <w:rFonts w:ascii="Arial" w:hAnsi="Arial" w:cs="Arial"/>
-          <w:i/>
-          <w:iCs/>
-          <w:lang w:val="pt-BR"/>
-        </w:rPr>
-        <w:t>Autor 2: [NOME DO AUTOR]</w:t>
+        <w:t>Autor: Nathan Menezes</w:t>
       </w:r>
     </w:p>
     <w:p>

</xml_diff>

<commit_message>
Adiciona link do repositório no Anexo A do relatório
</commit_message>
<xml_diff>
--- a/relatorio/Relatorio-Ordenacao-Paralela.docx
+++ b/relatorio/Relatorio-Ordenacao-Paralela.docx
@@ -14716,7 +14716,29 @@
           <w:szCs w:val="22"/>
           <w:lang w:val="pt-BR"/>
         </w:rPr>
-        <w:t xml:space="preserve"> O código-fonte, os arquivos CSV com todas as medições e os gráficos estão disponíveis em: [INSERIR LINK DO REPOSITÓRIO NO GITHUB].</w:t>
+        <w:t xml:space="preserve"> O código-fonte, os arquivos CSV com todas as medições e os gráficos estão disponíveis em: </w:t>
+      </w:r>
+      <w:hyperlink r:id="rId8" w:history="1">
+        <w:r>
+          <w:rPr>
+            <w:rFonts w:ascii="Arial" w:hAnsi="Arial" w:cs="Arial"/>
+            <w:color w:val="0563C1"/>
+            <w:sz w:val="22"/>
+            <w:szCs w:val="22"/>
+            <w:u w:val="single"/>
+            <w:lang w:val="pt-BR"/>
+          </w:rPr>
+          <w:t>https://github.com/dynasmon/alg-analise</w:t>
+        </w:r>
+      </w:hyperlink>
+      <w:r>
+        <w:rPr>
+          <w:rFonts w:ascii="Arial" w:hAnsi="Arial" w:cs="Arial"/>
+          <w:sz w:val="22"/>
+          <w:szCs w:val="22"/>
+          <w:lang w:val="pt-BR"/>
+        </w:rPr>
+        <w:t>.</w:t>
       </w:r>
     </w:p>
     <w:p>

</xml_diff>

<commit_message>
Atualiza passos de execução
</commit_message>
<xml_diff>
--- a/relatorio/Relatorio-Ordenacao-Paralela.docx
+++ b/relatorio/Relatorio-Ordenacao-Paralela.docx
@@ -14751,11 +14751,146 @@
       <w:r>
         <w:rPr>
           <w:rFonts w:ascii="Arial" w:hAnsi="Arial" w:cs="Arial"/>
+          <w:b/>
+          <w:bCs/>
           <w:sz w:val="22"/>
           <w:szCs w:val="22"/>
           <w:lang w:val="pt-BR"/>
         </w:rPr>
-        <w:t xml:space="preserve">O programa é executado por linha de comando (./executar.sh benchmark, analisar, validar ou gui). Os arquivos gerados são: medicoes.csv (uma linha por medição), resumo.csv (média, desvio, CV, mediana, mínimo, máximo, IC 95%, speedups, eficiência e Karp-Flatt por configuração), crescimento.csv (expoente empírico e R²) e ambiente.csv (hardware, sistema e JVM).</w:t>
+        <w:t xml:space="preserve">Execução do programa.</w:t>
+      </w:r>
+      <w:r>
+        <w:rPr>
+          <w:rFonts w:ascii="Arial" w:hAnsi="Arial" w:cs="Arial"/>
+          <w:sz w:val="22"/>
+          <w:szCs w:val="22"/>
+          <w:lang w:val="pt-BR"/>
+        </w:rPr>
+        <w:t xml:space="preserve"> É necessário um JDK 17 ou mais recente, disponível em </w:t>
+      </w:r>
+      <w:hyperlink r:id="rId9" w:history="1">
+        <w:r>
+          <w:rPr>
+            <w:rFonts w:ascii="Arial" w:hAnsi="Arial" w:cs="Arial"/>
+            <w:color w:val="0563C1"/>
+            <w:sz w:val="22"/>
+            <w:szCs w:val="22"/>
+            <w:u w:val="single"/>
+            <w:lang w:val="pt-BR"/>
+          </w:rPr>
+          <w:t>https://adoptium.net/temurin/releases/</w:t>
+        </w:r>
+      </w:hyperlink>
+      <w:r>
+        <w:rPr>
+          <w:rFonts w:ascii="Arial" w:hAnsi="Arial" w:cs="Arial"/>
+          <w:sz w:val="22"/>
+          <w:szCs w:val="22"/>
+          <w:lang w:val="pt-BR"/>
+        </w:rPr>
+        <w:t xml:space="preserve">. O programa roda no Windows, no macOS e no Linux. Os comandos abaixo são digitados na pasta do projeto, precedidos de .\executar.bat no Windows e de ./executar.sh no macOS e no Linux.</w:t>
+      </w:r>
+    </w:p>
+    <w:p>
+      <w:pPr>
+        <w:pStyle w:val="TAMainText"/>
+        <w:spacing w:before="0" w:after="60" w:line="360" w:lineRule="auto"/>
+        <w:ind w:left="331" w:right="130" w:hanging="245"/>
+        <w:jc w:val="left"/>
+      </w:pPr>
+      <w:r>
+        <w:rPr>
+          <w:rFonts w:ascii="Arial" w:hAnsi="Arial" w:cs="Arial"/>
+          <w:sz w:val="22"/>
+          <w:szCs w:val="22"/>
+          <w:lang w:val="pt-BR"/>
+        </w:rPr>
+        <w:t xml:space="preserve">1. Baixar o repositório (botão Code, opção Download ZIP) e extrair a pasta inteira.</w:t>
+      </w:r>
+    </w:p>
+    <w:p>
+      <w:pPr>
+        <w:pStyle w:val="TAMainText"/>
+        <w:spacing w:before="0" w:after="60" w:line="360" w:lineRule="auto"/>
+        <w:ind w:left="331" w:right="130" w:hanging="245"/>
+        <w:jc w:val="left"/>
+      </w:pPr>
+      <w:r>
+        <w:rPr>
+          <w:rFonts w:ascii="Arial" w:hAnsi="Arial" w:cs="Arial"/>
+          <w:sz w:val="22"/>
+          <w:szCs w:val="22"/>
+          <w:lang w:val="pt-BR"/>
+        </w:rPr>
+        <w:t xml:space="preserve">2. Abrir a interface gráfica. No Windows, basta dar dois cliques em executar.bat; no macOS e no Linux, use ./executar.sh gui. Na primeira vez o código é compilado automaticamente, e a interface abre com os resultados deste trabalho. Para novos testes, escolha os algoritmos, a natureza dos dados e os parâmetros e clique em Executar.</w:t>
+      </w:r>
+    </w:p>
+    <w:p>
+      <w:pPr>
+        <w:pStyle w:val="TAMainText"/>
+        <w:spacing w:before="0" w:after="60" w:line="360" w:lineRule="auto"/>
+        <w:ind w:left="331" w:right="130" w:hanging="245"/>
+        <w:jc w:val="left"/>
+      </w:pPr>
+      <w:r>
+        <w:rPr>
+          <w:rFonts w:ascii="Arial" w:hAnsi="Arial" w:cs="Arial"/>
+          <w:sz w:val="22"/>
+          <w:szCs w:val="22"/>
+          <w:lang w:val="pt-BR"/>
+        </w:rPr>
+        <w:t xml:space="preserve">3. Validar os algoritmos com o comando validar, por exemplo .\executar.bat validar. A saída esperada termina com “Todos os algoritmos ordenaram corretamente.”.</w:t>
+      </w:r>
+    </w:p>
+    <w:p>
+      <w:pPr>
+        <w:pStyle w:val="TAMainText"/>
+        <w:spacing w:before="0" w:after="60" w:line="360" w:lineRule="auto"/>
+        <w:ind w:left="331" w:right="130" w:hanging="245"/>
+        <w:jc w:val="left"/>
+      </w:pPr>
+      <w:r>
+        <w:rPr>
+          <w:rFonts w:ascii="Arial" w:hAnsi="Arial" w:cs="Arial"/>
+          <w:sz w:val="22"/>
+          <w:szCs w:val="22"/>
+          <w:lang w:val="pt-BR"/>
+        </w:rPr>
+        <w:t xml:space="preserve">4. Repetir os experimentos com benchmark --saida novos-resultados. A opção --rapido executa uma versão reduzida. Sem --saida, os arquivos da pasta resultados, que contêm os dados deste relatório, são substituídos.</w:t>
+      </w:r>
+    </w:p>
+    <w:p>
+      <w:pPr>
+        <w:pStyle w:val="TAMainText"/>
+        <w:spacing w:before="0" w:after="60" w:line="360" w:lineRule="auto"/>
+        <w:ind w:left="331" w:right="130" w:hanging="245"/>
+        <w:jc w:val="left"/>
+      </w:pPr>
+      <w:r>
+        <w:rPr>
+          <w:rFonts w:ascii="Arial" w:hAnsi="Arial" w:cs="Arial"/>
+          <w:sz w:val="22"/>
+          <w:szCs w:val="22"/>
+          <w:lang w:val="pt-BR"/>
+        </w:rPr>
+        <w:t xml:space="preserve">5. Refazer a análise, quando necessário, com analisar --saida novos-resultados, que recalcula o resumo, o crescimento e os gráficos a partir de medicoes.csv.</w:t>
+      </w:r>
+    </w:p>
+    <w:p>
+      <w:pPr>
+        <w:pStyle w:val="TAMainText"/>
+        <w:spacing w:before="0" w:after="120" w:line="360" w:lineRule="auto"/>
+        <w:ind w:left="86" w:right="130" w:firstLine="0"/>
+        <w:jc w:val="both"/>
+      </w:pPr>
+      <w:r>
+        <w:rPr>
+          <w:rFonts w:ascii="Arial" w:hAnsi="Arial" w:cs="Arial"/>
+          <w:sz w:val="22"/>
+          <w:szCs w:val="22"/>
+          <w:lang w:val="pt-BR"/>
+        </w:rPr>
+        <w:t xml:space="preserve">Os tempos variam conforme a máquina: os valores deste relatório foram obtidos no equipamento descrito na Metodologia. Os arquivos gerados são: medicoes.csv (uma linha por medição), resumo.csv (média, desvio, CV, mediana, mínimo, máximo, IC 95%, speedups, eficiência e Karp-Flatt por configuração), crescimento.csv (expoente empírico e R²) e ambiente.csv (hardware, sistema e JVM).</w:t>
       </w:r>
     </w:p>
     <w:p>

</xml_diff>